<commit_message>
feat: implement advanced dark mode system with dynamic CSS variables and global theme support
</commit_message>
<xml_diff>
--- a/Corruption Complaint Management System.docx
+++ b/Corruption Complaint Management System.docx
@@ -4,6 +4,7 @@
   <w:body>
     <w:p>
       <w:pPr>
+        <w:shd w:val="clear" w:color="auto" w:fill="FFFFFF" w:themeFill="background1"/>
         <w:jc w:val="center"/>
         <w:rPr>
           <w:sz w:val="32"/>
@@ -21,40 +22,34 @@
       </w:r>
     </w:p>
     <w:p>
-      <w:r>
-        <w:pict w14:anchorId="792263A0">
-          <v:rect id="_x0000_i1025" style="width:0;height:1.5pt" o:hralign="center" o:hrstd="t" o:hr="t" fillcolor="#a0a0a0" stroked="f"/>
-        </w:pict>
-      </w:r>
-    </w:p>
-    <w:p>
       <w:pPr>
         <w:rPr>
           <w:b/>
           <w:bCs/>
         </w:rPr>
       </w:pPr>
-      <w:r>
+    </w:p>
+    <w:p>
+      <w:pPr>
         <w:rPr>
           <w:b/>
           <w:bCs/>
         </w:rPr>
-        <w:t>1. Introduction</w:t>
-      </w:r>
-    </w:p>
-    <w:p>
-      <w:r>
-        <w:t xml:space="preserve">The </w:t>
-      </w:r>
+      </w:pPr>
       <w:r>
         <w:rPr>
           <w:b/>
           <w:bCs/>
         </w:rPr>
-        <w:t>Corruption Complaint Management System (CCMS)</w:t>
-      </w:r>
-      <w:r>
-        <w:t xml:space="preserve"> is a web-based application developed using </w:t>
+        <w:t>1. Introduction</w:t>
+      </w:r>
+    </w:p>
+    <w:p>
+      <w:r>
+        <w:t>The Corruption Complaint Management System (CCMS) is a web-based application</w:t>
+      </w:r>
+      <w:r>
+        <w:t xml:space="preserve"> developed using </w:t>
       </w:r>
       <w:r>
         <w:rPr>
@@ -89,7 +84,7 @@
     <w:p>
       <w:r>
         <w:pict w14:anchorId="3754FC91">
-          <v:rect id="_x0000_i1026" style="width:0;height:1.5pt" o:hralign="center" o:hrstd="t" o:hr="t" fillcolor="#a0a0a0" stroked="f"/>
+          <v:rect id="_x0000_i1027" style="width:0;height:1.5pt" o:hralign="center" o:hrstd="t" o:hr="t" fillcolor="#a0a0a0" stroked="f"/>
         </w:pict>
       </w:r>
     </w:p>
@@ -198,7 +193,7 @@
     <w:p>
       <w:r>
         <w:pict w14:anchorId="526A21DD">
-          <v:rect id="_x0000_i1027" style="width:0;height:1.5pt" o:hralign="center" o:hrstd="t" o:hr="t" fillcolor="#a0a0a0" stroked="f"/>
+          <v:rect id="_x0000_i1028" style="width:0;height:1.5pt" o:hralign="center" o:hrstd="t" o:hr="t" fillcolor="#a0a0a0" stroked="f"/>
         </w:pict>
       </w:r>
     </w:p>
@@ -298,7 +293,7 @@
     <w:p>
       <w:r>
         <w:pict w14:anchorId="4CA1F74C">
-          <v:rect id="_x0000_i1028" style="width:0;height:1.5pt" o:hralign="center" o:hrstd="t" o:hr="t" fillcolor="#a0a0a0" stroked="f"/>
+          <v:rect id="_x0000_i1029" style="width:0;height:1.5pt" o:hralign="center" o:hrstd="t" o:hr="t" fillcolor="#a0a0a0" stroked="f"/>
         </w:pict>
       </w:r>
     </w:p>
@@ -330,7 +325,7 @@
         <w:tblLook w:val="04A0" w:firstRow="1" w:lastRow="0" w:firstColumn="1" w:lastColumn="0" w:noHBand="0" w:noVBand="1"/>
       </w:tblPr>
       <w:tblGrid>
-        <w:gridCol w:w="1514"/>
+        <w:gridCol w:w="1627"/>
         <w:gridCol w:w="3459"/>
       </w:tblGrid>
       <w:tr>
@@ -340,7 +335,7 @@
         </w:trPr>
         <w:tc>
           <w:tcPr>
-            <w:tcW w:w="0" w:type="auto"/>
+            <w:tcW w:w="1582" w:type="dxa"/>
             <w:vAlign w:val="center"/>
             <w:hideMark/>
           </w:tcPr>
@@ -389,7 +384,7 @@
         </w:trPr>
         <w:tc>
           <w:tcPr>
-            <w:tcW w:w="0" w:type="auto"/>
+            <w:tcW w:w="1582" w:type="dxa"/>
             <w:vAlign w:val="center"/>
             <w:hideMark/>
           </w:tcPr>
@@ -418,7 +413,7 @@
         </w:trPr>
         <w:tc>
           <w:tcPr>
-            <w:tcW w:w="0" w:type="auto"/>
+            <w:tcW w:w="1582" w:type="dxa"/>
             <w:vAlign w:val="center"/>
             <w:hideMark/>
           </w:tcPr>
@@ -447,7 +442,7 @@
         </w:trPr>
         <w:tc>
           <w:tcPr>
-            <w:tcW w:w="0" w:type="auto"/>
+            <w:tcW w:w="1582" w:type="dxa"/>
             <w:vAlign w:val="center"/>
             <w:hideMark/>
           </w:tcPr>
@@ -476,7 +471,7 @@
         </w:trPr>
         <w:tc>
           <w:tcPr>
-            <w:tcW w:w="0" w:type="auto"/>
+            <w:tcW w:w="1582" w:type="dxa"/>
             <w:vAlign w:val="center"/>
             <w:hideMark/>
           </w:tcPr>
@@ -505,7 +500,7 @@
         </w:trPr>
         <w:tc>
           <w:tcPr>
-            <w:tcW w:w="0" w:type="auto"/>
+            <w:tcW w:w="1582" w:type="dxa"/>
             <w:vAlign w:val="center"/>
             <w:hideMark/>
           </w:tcPr>
@@ -534,7 +529,7 @@
         </w:trPr>
         <w:tc>
           <w:tcPr>
-            <w:tcW w:w="0" w:type="auto"/>
+            <w:tcW w:w="1582" w:type="dxa"/>
             <w:vAlign w:val="center"/>
             <w:hideMark/>
           </w:tcPr>
@@ -563,7 +558,7 @@
         </w:trPr>
         <w:tc>
           <w:tcPr>
-            <w:tcW w:w="0" w:type="auto"/>
+            <w:tcW w:w="1582" w:type="dxa"/>
             <w:vAlign w:val="center"/>
             <w:hideMark/>
           </w:tcPr>
@@ -590,7 +585,7 @@
     <w:p>
       <w:r>
         <w:pict w14:anchorId="7C98FA8B">
-          <v:rect id="_x0000_i1029" style="width:0;height:1.5pt" o:hralign="center" o:hrstd="t" o:hr="t" fillcolor="#a0a0a0" stroked="f"/>
+          <v:rect id="_x0000_i1030" style="width:0;height:1.5pt" o:hralign="center" o:hrstd="t" o:hr="t" fillcolor="#a0a0a0" stroked="f"/>
         </w:pict>
       </w:r>
     </w:p>
@@ -753,7 +748,7 @@
     <w:p>
       <w:r>
         <w:pict w14:anchorId="13D0A1D5">
-          <v:rect id="_x0000_i1030" style="width:0;height:1.5pt" o:hralign="center" o:hrstd="t" o:hr="t" fillcolor="#a0a0a0" stroked="f"/>
+          <v:rect id="_x0000_i1031" style="width:0;height:1.5pt" o:hralign="center" o:hrstd="t" o:hr="t" fillcolor="#a0a0a0" stroked="f"/>
         </w:pict>
       </w:r>
     </w:p>
@@ -880,7 +875,7 @@
     <w:p>
       <w:r>
         <w:pict w14:anchorId="45DD1B41">
-          <v:rect id="_x0000_i1031" style="width:0;height:1.5pt" o:hralign="center" o:hrstd="t" o:hr="t" fillcolor="#a0a0a0" stroked="f"/>
+          <v:rect id="_x0000_i1032" style="width:0;height:1.5pt" o:hralign="center" o:hrstd="t" o:hr="t" fillcolor="#a0a0a0" stroked="f"/>
         </w:pict>
       </w:r>
     </w:p>
@@ -1028,7 +1023,7 @@
     <w:p>
       <w:r>
         <w:pict w14:anchorId="4E6B7344">
-          <v:rect id="_x0000_i1032" style="width:0;height:1.5pt" o:hralign="center" o:hrstd="t" o:hr="t" fillcolor="#a0a0a0" stroked="f"/>
+          <v:rect id="_x0000_i1033" style="width:0;height:1.5pt" o:hralign="center" o:hrstd="t" o:hr="t" fillcolor="#a0a0a0" stroked="f"/>
         </w:pict>
       </w:r>
     </w:p>
@@ -1121,7 +1116,7 @@
     <w:p>
       <w:r>
         <w:pict w14:anchorId="0B31CBB4">
-          <v:rect id="_x0000_i1033" style="width:0;height:1.5pt" o:hralign="center" o:hrstd="t" o:hr="t" fillcolor="#a0a0a0" stroked="f"/>
+          <v:rect id="_x0000_i1034" style="width:0;height:1.5pt" o:hralign="center" o:hrstd="t" o:hr="t" fillcolor="#a0a0a0" stroked="f"/>
         </w:pict>
       </w:r>
     </w:p>
@@ -1209,7 +1204,7 @@
     <w:p>
       <w:r>
         <w:pict w14:anchorId="10605D42">
-          <v:rect id="_x0000_i1034" style="width:0;height:1.5pt" o:hralign="center" o:hrstd="t" o:hr="t" fillcolor="#a0a0a0" stroked="f"/>
+          <v:rect id="_x0000_i1035" style="width:0;height:1.5pt" o:hralign="center" o:hrstd="t" o:hr="t" fillcolor="#a0a0a0" stroked="f"/>
         </w:pict>
       </w:r>
     </w:p>
@@ -1286,7 +1281,7 @@
     <w:p>
       <w:r>
         <w:pict w14:anchorId="5BE66E8A">
-          <v:rect id="_x0000_i1035" style="width:0;height:1.5pt" o:hralign="center" o:hrstd="t" o:hr="t" fillcolor="#a0a0a0" stroked="f"/>
+          <v:rect id="_x0000_i1036" style="width:0;height:1.5pt" o:hralign="center" o:hrstd="t" o:hr="t" fillcolor="#a0a0a0" stroked="f"/>
         </w:pict>
       </w:r>
     </w:p>
@@ -1341,7 +1336,7 @@
     <w:p>
       <w:r>
         <w:pict w14:anchorId="322B7B80">
-          <v:rect id="_x0000_i1036" style="width:0;height:1.5pt" o:hralign="center" o:hrstd="t" o:hr="t" fillcolor="#a0a0a0" stroked="f"/>
+          <v:rect id="_x0000_i1037" style="width:0;height:1.5pt" o:hralign="center" o:hrstd="t" o:hr="t" fillcolor="#a0a0a0" stroked="f"/>
         </w:pict>
       </w:r>
     </w:p>
@@ -1419,7 +1414,7 @@
     <w:p>
       <w:r>
         <w:pict w14:anchorId="492DAF65">
-          <v:rect id="_x0000_i1037" style="width:0;height:1.5pt" o:hralign="center" o:hrstd="t" o:hr="t" fillcolor="#a0a0a0" stroked="f"/>
+          <v:rect id="_x0000_i1038" style="width:0;height:1.5pt" o:hralign="center" o:hrstd="t" o:hr="t" fillcolor="#a0a0a0" stroked="f"/>
         </w:pict>
       </w:r>
     </w:p>
@@ -1562,7 +1557,7 @@
     <w:p>
       <w:r>
         <w:pict w14:anchorId="78AEA3FC">
-          <v:rect id="_x0000_i1038" style="width:0;height:1.5pt" o:hralign="center" o:hrstd="t" o:hr="t" fillcolor="#a0a0a0" stroked="f"/>
+          <v:rect id="_x0000_i1039" style="width:0;height:1.5pt" o:hralign="center" o:hrstd="t" o:hr="t" fillcolor="#a0a0a0" stroked="f"/>
         </w:pict>
       </w:r>
     </w:p>
@@ -1684,7 +1679,7 @@
       <w:r>
         <w:lastRenderedPageBreak/>
         <w:pict w14:anchorId="5ED5E2C5">
-          <v:rect id="_x0000_i1039" style="width:0;height:1.5pt" o:hralign="center" o:hrstd="t" o:hr="t" fillcolor="#a0a0a0" stroked="f"/>
+          <v:rect id="_x0000_i1040" style="width:0;height:1.5pt" o:hralign="center" o:hrstd="t" o:hr="t" fillcolor="#a0a0a0" stroked="f"/>
         </w:pict>
       </w:r>
     </w:p>
@@ -1819,9 +1814,11 @@
             <w:hideMark/>
           </w:tcPr>
           <w:p>
+            <w:proofErr w:type="spellStart"/>
             <w:r>
               <w:t>user_id</w:t>
             </w:r>
+            <w:proofErr w:type="spellEnd"/>
           </w:p>
         </w:tc>
         <w:tc>
@@ -1872,8 +1869,13 @@
             <w:hideMark/>
           </w:tcPr>
           <w:p>
-            <w:r>
-              <w:t>VARCHAR(100)</w:t>
+            <w:proofErr w:type="gramStart"/>
+            <w:r>
+              <w:t>VARCHAR(</w:t>
+            </w:r>
+            <w:proofErr w:type="gramEnd"/>
+            <w:r>
+              <w:t>100)</w:t>
             </w:r>
           </w:p>
         </w:tc>
@@ -1913,8 +1915,13 @@
             <w:hideMark/>
           </w:tcPr>
           <w:p>
-            <w:r>
-              <w:t>VARCHAR(100)</w:t>
+            <w:proofErr w:type="gramStart"/>
+            <w:r>
+              <w:t>VARCHAR(</w:t>
+            </w:r>
+            <w:proofErr w:type="gramEnd"/>
+            <w:r>
+              <w:t>100)</w:t>
             </w:r>
           </w:p>
         </w:tc>
@@ -1954,8 +1961,13 @@
             <w:hideMark/>
           </w:tcPr>
           <w:p>
-            <w:r>
-              <w:t>VARCHAR(15)</w:t>
+            <w:proofErr w:type="gramStart"/>
+            <w:r>
+              <w:t>VARCHAR(</w:t>
+            </w:r>
+            <w:proofErr w:type="gramEnd"/>
+            <w:r>
+              <w:t>15)</w:t>
             </w:r>
           </w:p>
         </w:tc>
@@ -1995,8 +2007,13 @@
             <w:hideMark/>
           </w:tcPr>
           <w:p>
-            <w:r>
-              <w:t>VARCHAR(255)</w:t>
+            <w:proofErr w:type="gramStart"/>
+            <w:r>
+              <w:t>VARCHAR(</w:t>
+            </w:r>
+            <w:proofErr w:type="gramEnd"/>
+            <w:r>
+              <w:t>255)</w:t>
             </w:r>
           </w:p>
         </w:tc>
@@ -2078,7 +2095,15 @@
           </w:tcPr>
           <w:p>
             <w:r>
-              <w:t>ENUM('Citizen','Admin')</w:t>
+              <w:t>ENUM('</w:t>
+            </w:r>
+            <w:proofErr w:type="spellStart"/>
+            <w:r>
+              <w:t>Citizen','Admin</w:t>
+            </w:r>
+            <w:proofErr w:type="spellEnd"/>
+            <w:r>
+              <w:t>')</w:t>
             </w:r>
           </w:p>
         </w:tc>
@@ -2106,9 +2131,11 @@
             <w:hideMark/>
           </w:tcPr>
           <w:p>
+            <w:proofErr w:type="spellStart"/>
             <w:r>
               <w:t>created_at</w:t>
             </w:r>
+            <w:proofErr w:type="spellEnd"/>
           </w:p>
         </w:tc>
         <w:tc>
@@ -2140,7 +2167,7 @@
     <w:p>
       <w:r>
         <w:pict w14:anchorId="4E6992E1">
-          <v:rect id="_x0000_i1040" style="width:0;height:1.5pt" o:hralign="center" o:hrstd="t" o:hr="t" fillcolor="#a0a0a0" stroked="f"/>
+          <v:rect id="_x0000_i1041" style="width:0;height:1.5pt" o:hralign="center" o:hrstd="t" o:hr="t" fillcolor="#a0a0a0" stroked="f"/>
         </w:pict>
       </w:r>
     </w:p>
@@ -2270,9 +2297,11 @@
             <w:pPr>
               <w:spacing w:line="240" w:lineRule="auto"/>
             </w:pPr>
+            <w:proofErr w:type="spellStart"/>
             <w:r>
               <w:t>complaint_id</w:t>
             </w:r>
+            <w:proofErr w:type="spellEnd"/>
           </w:p>
         </w:tc>
         <w:tc>
@@ -2320,9 +2349,11 @@
             <w:pPr>
               <w:spacing w:line="240" w:lineRule="auto"/>
             </w:pPr>
+            <w:proofErr w:type="spellStart"/>
             <w:r>
               <w:t>user_id</w:t>
             </w:r>
+            <w:proofErr w:type="spellEnd"/>
           </w:p>
         </w:tc>
         <w:tc>
@@ -2370,9 +2401,11 @@
             <w:pPr>
               <w:spacing w:line="240" w:lineRule="auto"/>
             </w:pPr>
+            <w:proofErr w:type="spellStart"/>
             <w:r>
               <w:t>category_id</w:t>
             </w:r>
+            <w:proofErr w:type="spellEnd"/>
           </w:p>
         </w:tc>
         <w:tc>
@@ -2435,8 +2468,13 @@
             <w:pPr>
               <w:spacing w:line="240" w:lineRule="auto"/>
             </w:pPr>
-            <w:r>
-              <w:t>VARCHAR(200)</w:t>
+            <w:proofErr w:type="gramStart"/>
+            <w:r>
+              <w:t>VARCHAR(</w:t>
+            </w:r>
+            <w:proofErr w:type="gramEnd"/>
+            <w:r>
+              <w:t>200)</w:t>
             </w:r>
           </w:p>
         </w:tc>
@@ -2535,8 +2573,13 @@
             <w:pPr>
               <w:spacing w:line="240" w:lineRule="auto"/>
             </w:pPr>
-            <w:r>
-              <w:t>VARCHAR(200)</w:t>
+            <w:proofErr w:type="gramStart"/>
+            <w:r>
+              <w:t>VARCHAR(</w:t>
+            </w:r>
+            <w:proofErr w:type="gramEnd"/>
+            <w:r>
+              <w:t>200)</w:t>
             </w:r>
           </w:p>
         </w:tc>
@@ -2585,8 +2628,13 @@
             <w:pPr>
               <w:spacing w:line="240" w:lineRule="auto"/>
             </w:pPr>
-            <w:r>
-              <w:t>VARCHAR(255)</w:t>
+            <w:proofErr w:type="gramStart"/>
+            <w:r>
+              <w:t>VARCHAR(</w:t>
+            </w:r>
+            <w:proofErr w:type="gramEnd"/>
+            <w:r>
+              <w:t>255)</w:t>
             </w:r>
           </w:p>
         </w:tc>
@@ -2643,7 +2691,23 @@
                 <w:sz w:val="20"/>
                 <w:szCs w:val="20"/>
               </w:rPr>
-              <w:t>('Low','Medium','High','Critical')</w:t>
+              <w:t>('</w:t>
+            </w:r>
+            <w:proofErr w:type="spellStart"/>
+            <w:r>
+              <w:rPr>
+                <w:sz w:val="20"/>
+                <w:szCs w:val="20"/>
+              </w:rPr>
+              <w:t>Low','Medium','High','Critical</w:t>
+            </w:r>
+            <w:proofErr w:type="spellEnd"/>
+            <w:r>
+              <w:rPr>
+                <w:sz w:val="20"/>
+                <w:szCs w:val="20"/>
+              </w:rPr>
+              <w:t>')</w:t>
             </w:r>
           </w:p>
         </w:tc>
@@ -2727,9 +2791,11 @@
             <w:pPr>
               <w:spacing w:line="240" w:lineRule="auto"/>
             </w:pPr>
+            <w:proofErr w:type="spellStart"/>
             <w:r>
               <w:t>assigned_officer</w:t>
             </w:r>
+            <w:proofErr w:type="spellEnd"/>
           </w:p>
         </w:tc>
         <w:tc>
@@ -2776,9 +2842,11 @@
             <w:pPr>
               <w:spacing w:line="240" w:lineRule="auto"/>
             </w:pPr>
+            <w:proofErr w:type="spellStart"/>
             <w:r>
               <w:t>created_at</w:t>
             </w:r>
+            <w:proofErr w:type="spellEnd"/>
           </w:p>
         </w:tc>
         <w:tc>
@@ -2815,7 +2883,7 @@
       <w:r>
         <w:lastRenderedPageBreak/>
         <w:pict w14:anchorId="4334B07C">
-          <v:rect id="_x0000_i1041" style="width:0;height:1.5pt" o:hralign="center" o:hrstd="t" o:hr="t" fillcolor="#a0a0a0" stroked="f"/>
+          <v:rect id="_x0000_i1042" style="width:0;height:1.5pt" o:hralign="center" o:hrstd="t" o:hr="t" fillcolor="#a0a0a0" stroked="f"/>
         </w:pict>
       </w:r>
     </w:p>
@@ -2935,9 +3003,11 @@
             <w:hideMark/>
           </w:tcPr>
           <w:p>
+            <w:proofErr w:type="spellStart"/>
             <w:r>
               <w:t>officer_id</w:t>
             </w:r>
+            <w:proofErr w:type="spellEnd"/>
           </w:p>
         </w:tc>
         <w:tc>
@@ -2976,9 +3046,11 @@
             <w:hideMark/>
           </w:tcPr>
           <w:p>
+            <w:proofErr w:type="spellStart"/>
             <w:r>
               <w:t>department_id</w:t>
             </w:r>
+            <w:proofErr w:type="spellEnd"/>
           </w:p>
         </w:tc>
         <w:tc>
@@ -3029,8 +3101,13 @@
             <w:hideMark/>
           </w:tcPr>
           <w:p>
-            <w:r>
-              <w:t>VARCHAR(100)</w:t>
+            <w:proofErr w:type="gramStart"/>
+            <w:r>
+              <w:t>VARCHAR(</w:t>
+            </w:r>
+            <w:proofErr w:type="gramEnd"/>
+            <w:r>
+              <w:t>100)</w:t>
             </w:r>
           </w:p>
         </w:tc>
@@ -3070,8 +3147,13 @@
             <w:hideMark/>
           </w:tcPr>
           <w:p>
-            <w:r>
-              <w:t>VARCHAR(100)</w:t>
+            <w:proofErr w:type="gramStart"/>
+            <w:r>
+              <w:t>VARCHAR(</w:t>
+            </w:r>
+            <w:proofErr w:type="gramEnd"/>
+            <w:r>
+              <w:t>100)</w:t>
             </w:r>
           </w:p>
         </w:tc>
@@ -3111,8 +3193,13 @@
             <w:hideMark/>
           </w:tcPr>
           <w:p>
-            <w:r>
-              <w:t>VARCHAR(100)</w:t>
+            <w:proofErr w:type="gramStart"/>
+            <w:r>
+              <w:t>VARCHAR(</w:t>
+            </w:r>
+            <w:proofErr w:type="gramEnd"/>
+            <w:r>
+              <w:t>100)</w:t>
             </w:r>
           </w:p>
         </w:tc>
@@ -3152,8 +3239,13 @@
             <w:hideMark/>
           </w:tcPr>
           <w:p>
-            <w:r>
-              <w:t>VARCHAR(15)</w:t>
+            <w:proofErr w:type="gramStart"/>
+            <w:r>
+              <w:t>VARCHAR(</w:t>
+            </w:r>
+            <w:proofErr w:type="gramEnd"/>
+            <w:r>
+              <w:t>15)</w:t>
             </w:r>
           </w:p>
         </w:tc>
@@ -3193,8 +3285,13 @@
             <w:hideMark/>
           </w:tcPr>
           <w:p>
-            <w:r>
-              <w:t>VARCHAR(255)</w:t>
+            <w:proofErr w:type="gramStart"/>
+            <w:r>
+              <w:t>VARCHAR(</w:t>
+            </w:r>
+            <w:proofErr w:type="gramEnd"/>
+            <w:r>
+              <w:t>255)</w:t>
             </w:r>
           </w:p>
         </w:tc>
@@ -3235,7 +3332,15 @@
           </w:tcPr>
           <w:p>
             <w:r>
-              <w:t>ENUM('Active','Inactive')</w:t>
+              <w:t>ENUM('</w:t>
+            </w:r>
+            <w:proofErr w:type="spellStart"/>
+            <w:r>
+              <w:t>Active','Inactive</w:t>
+            </w:r>
+            <w:proofErr w:type="spellEnd"/>
+            <w:r>
+              <w:t>')</w:t>
             </w:r>
           </w:p>
         </w:tc>
@@ -3256,7 +3361,7 @@
     <w:p>
       <w:r>
         <w:pict w14:anchorId="57634A5B">
-          <v:rect id="_x0000_i1042" style="width:0;height:1.5pt" o:hralign="center" o:hrstd="t" o:hr="t" fillcolor="#a0a0a0" stroked="f"/>
+          <v:rect id="_x0000_i1043" style="width:0;height:1.5pt" o:hralign="center" o:hrstd="t" o:hr="t" fillcolor="#a0a0a0" stroked="f"/>
         </w:pict>
       </w:r>
     </w:p>
@@ -3375,9 +3480,11 @@
             <w:hideMark/>
           </w:tcPr>
           <w:p>
+            <w:proofErr w:type="spellStart"/>
             <w:r>
               <w:t>investigation_id</w:t>
             </w:r>
+            <w:proofErr w:type="spellEnd"/>
           </w:p>
         </w:tc>
         <w:tc>
@@ -3416,9 +3523,11 @@
             <w:hideMark/>
           </w:tcPr>
           <w:p>
+            <w:proofErr w:type="spellStart"/>
             <w:r>
               <w:t>complaint_id</w:t>
             </w:r>
+            <w:proofErr w:type="spellEnd"/>
           </w:p>
         </w:tc>
         <w:tc>
@@ -3457,9 +3566,11 @@
             <w:hideMark/>
           </w:tcPr>
           <w:p>
+            <w:proofErr w:type="spellStart"/>
             <w:r>
               <w:t>officer_id</w:t>
             </w:r>
+            <w:proofErr w:type="spellEnd"/>
           </w:p>
         </w:tc>
         <w:tc>
@@ -3580,9 +3691,11 @@
             <w:hideMark/>
           </w:tcPr>
           <w:p>
+            <w:proofErr w:type="spellStart"/>
             <w:r>
               <w:t>report_file</w:t>
             </w:r>
+            <w:proofErr w:type="spellEnd"/>
           </w:p>
         </w:tc>
         <w:tc>
@@ -3592,8 +3705,13 @@
             <w:hideMark/>
           </w:tcPr>
           <w:p>
-            <w:r>
-              <w:t>VARCHAR(255)</w:t>
+            <w:proofErr w:type="gramStart"/>
+            <w:r>
+              <w:t>VARCHAR(</w:t>
+            </w:r>
+            <w:proofErr w:type="gramEnd"/>
+            <w:r>
+              <w:t>255)</w:t>
             </w:r>
           </w:p>
         </w:tc>
@@ -3621,9 +3739,11 @@
             <w:hideMark/>
           </w:tcPr>
           <w:p>
+            <w:proofErr w:type="spellStart"/>
             <w:r>
               <w:t>updated_at</w:t>
             </w:r>
+            <w:proofErr w:type="spellEnd"/>
           </w:p>
         </w:tc>
         <w:tc>
@@ -3655,7 +3775,7 @@
     <w:p>
       <w:r>
         <w:pict w14:anchorId="17285F93">
-          <v:rect id="_x0000_i1043" style="width:0;height:1.5pt" o:hralign="center" o:hrstd="t" o:hr="t" fillcolor="#a0a0a0" stroked="f"/>
+          <v:rect id="_x0000_i1044" style="width:0;height:1.5pt" o:hralign="center" o:hrstd="t" o:hr="t" fillcolor="#a0a0a0" stroked="f"/>
         </w:pict>
       </w:r>
     </w:p>
@@ -3828,9 +3948,11 @@
             <w:hideMark/>
           </w:tcPr>
           <w:p>
+            <w:proofErr w:type="spellStart"/>
             <w:r>
               <w:t>category_id</w:t>
             </w:r>
+            <w:proofErr w:type="spellEnd"/>
           </w:p>
         </w:tc>
         <w:tc>
@@ -3875,9 +3997,11 @@
             <w:hideMark/>
           </w:tcPr>
           <w:p>
+            <w:proofErr w:type="spellStart"/>
             <w:r>
               <w:t>category_name</w:t>
             </w:r>
+            <w:proofErr w:type="spellEnd"/>
           </w:p>
         </w:tc>
         <w:tc>
@@ -3893,8 +4017,13 @@
             <w:hideMark/>
           </w:tcPr>
           <w:p>
-            <w:r>
-              <w:t>VARCHAR(100)</w:t>
+            <w:proofErr w:type="gramStart"/>
+            <w:r>
+              <w:t>VARCHAR(</w:t>
+            </w:r>
+            <w:proofErr w:type="gramEnd"/>
+            <w:r>
+              <w:t>100)</w:t>
             </w:r>
           </w:p>
         </w:tc>
@@ -3988,7 +4117,15 @@
           </w:tcPr>
           <w:p>
             <w:r>
-              <w:t>ENUM('Active','Inactive')</w:t>
+              <w:t>ENUM('</w:t>
+            </w:r>
+            <w:proofErr w:type="spellStart"/>
+            <w:r>
+              <w:t>Active','Inactive</w:t>
+            </w:r>
+            <w:proofErr w:type="spellEnd"/>
+            <w:r>
+              <w:t>')</w:t>
             </w:r>
           </w:p>
         </w:tc>
@@ -4016,9 +4153,11 @@
             <w:hideMark/>
           </w:tcPr>
           <w:p>
+            <w:proofErr w:type="spellStart"/>
             <w:r>
               <w:t>created_at</w:t>
             </w:r>
+            <w:proofErr w:type="spellEnd"/>
           </w:p>
         </w:tc>
         <w:tc>
@@ -4064,7 +4203,7 @@
     <w:p>
       <w:r>
         <w:pict w14:anchorId="02E74E11">
-          <v:rect id="_x0000_i1044" style="width:0;height:1.5pt" o:hralign="center" o:hrstd="t" o:hr="t" fillcolor="#a0a0a0" stroked="f"/>
+          <v:rect id="_x0000_i1045" style="width:0;height:1.5pt" o:hralign="center" o:hrstd="t" o:hr="t" fillcolor="#a0a0a0" stroked="f"/>
         </w:pict>
       </w:r>
     </w:p>
@@ -4184,9 +4323,11 @@
             <w:hideMark/>
           </w:tcPr>
           <w:p>
+            <w:proofErr w:type="spellStart"/>
             <w:r>
               <w:t>department_id</w:t>
             </w:r>
+            <w:proofErr w:type="spellEnd"/>
           </w:p>
         </w:tc>
         <w:tc>
@@ -4225,9 +4366,11 @@
             <w:hideMark/>
           </w:tcPr>
           <w:p>
+            <w:proofErr w:type="spellStart"/>
             <w:r>
               <w:t>department_name</w:t>
             </w:r>
+            <w:proofErr w:type="spellEnd"/>
           </w:p>
         </w:tc>
         <w:tc>
@@ -4237,8 +4380,13 @@
             <w:hideMark/>
           </w:tcPr>
           <w:p>
-            <w:r>
-              <w:t>VARCHAR(150)</w:t>
+            <w:proofErr w:type="gramStart"/>
+            <w:r>
+              <w:t>VARCHAR(</w:t>
+            </w:r>
+            <w:proofErr w:type="gramEnd"/>
+            <w:r>
+              <w:t>150)</w:t>
             </w:r>
           </w:p>
         </w:tc>
@@ -4327,7 +4475,23 @@
                 <w:sz w:val="20"/>
                 <w:szCs w:val="20"/>
               </w:rPr>
-              <w:t>'Active','Inactive')</w:t>
+              <w:t>'</w:t>
+            </w:r>
+            <w:proofErr w:type="spellStart"/>
+            <w:r>
+              <w:rPr>
+                <w:sz w:val="20"/>
+                <w:szCs w:val="20"/>
+              </w:rPr>
+              <w:t>Active','Inactive</w:t>
+            </w:r>
+            <w:proofErr w:type="spellEnd"/>
+            <w:r>
+              <w:rPr>
+                <w:sz w:val="20"/>
+                <w:szCs w:val="20"/>
+              </w:rPr>
+              <w:t>')</w:t>
             </w:r>
           </w:p>
         </w:tc>
@@ -4355,9 +4519,11 @@
             <w:hideMark/>
           </w:tcPr>
           <w:p>
+            <w:proofErr w:type="spellStart"/>
             <w:r>
               <w:t>created_at</w:t>
             </w:r>
+            <w:proofErr w:type="spellEnd"/>
           </w:p>
         </w:tc>
         <w:tc>
@@ -4389,7 +4555,7 @@
     <w:p>
       <w:r>
         <w:pict w14:anchorId="7EAA9679">
-          <v:rect id="_x0000_i1045" style="width:0;height:1.5pt" o:hralign="center" o:hrstd="t" o:hr="t" fillcolor="#a0a0a0" stroked="f"/>
+          <v:rect id="_x0000_i1046" style="width:0;height:1.5pt" o:hralign="center" o:hrstd="t" o:hr="t" fillcolor="#a0a0a0" stroked="f"/>
         </w:pict>
       </w:r>
     </w:p>
@@ -4508,9 +4674,11 @@
             <w:hideMark/>
           </w:tcPr>
           <w:p>
+            <w:proofErr w:type="spellStart"/>
             <w:r>
               <w:t>notification_id</w:t>
             </w:r>
+            <w:proofErr w:type="spellEnd"/>
           </w:p>
         </w:tc>
         <w:tc>
@@ -4532,8 +4700,13 @@
             <w:hideMark/>
           </w:tcPr>
           <w:p>
-            <w:r>
-              <w:t>PK,AUTO_INCREMENT</w:t>
+            <w:proofErr w:type="gramStart"/>
+            <w:r>
+              <w:t>PK,AUTO</w:t>
+            </w:r>
+            <w:proofErr w:type="gramEnd"/>
+            <w:r>
+              <w:t>_INCREMENT</w:t>
             </w:r>
           </w:p>
         </w:tc>
@@ -4549,9 +4722,11 @@
             <w:hideMark/>
           </w:tcPr>
           <w:p>
+            <w:proofErr w:type="spellStart"/>
             <w:r>
               <w:t>user_id</w:t>
             </w:r>
+            <w:proofErr w:type="spellEnd"/>
           </w:p>
         </w:tc>
         <w:tc>
@@ -4590,9 +4765,11 @@
             <w:hideMark/>
           </w:tcPr>
           <w:p>
+            <w:proofErr w:type="spellStart"/>
             <w:r>
               <w:t>complaint_id</w:t>
             </w:r>
+            <w:proofErr w:type="spellEnd"/>
           </w:p>
         </w:tc>
         <w:tc>
@@ -4685,7 +4862,15 @@
           </w:tcPr>
           <w:p>
             <w:r>
-              <w:t>ENUM('Unread','Read')</w:t>
+              <w:t>ENUM('</w:t>
+            </w:r>
+            <w:proofErr w:type="spellStart"/>
+            <w:r>
+              <w:t>Unread','Read</w:t>
+            </w:r>
+            <w:proofErr w:type="spellEnd"/>
+            <w:r>
+              <w:t>')</w:t>
             </w:r>
           </w:p>
         </w:tc>
@@ -4713,9 +4898,11 @@
             <w:hideMark/>
           </w:tcPr>
           <w:p>
+            <w:proofErr w:type="spellStart"/>
             <w:r>
               <w:t>created_at</w:t>
             </w:r>
+            <w:proofErr w:type="spellEnd"/>
           </w:p>
         </w:tc>
         <w:tc>
@@ -4748,7 +4935,7 @@
       <w:r>
         <w:lastRenderedPageBreak/>
         <w:pict w14:anchorId="715B97EB">
-          <v:rect id="_x0000_i1046" style="width:0;height:1.5pt" o:hralign="center" o:hrstd="t" o:hr="t" fillcolor="#a0a0a0" stroked="f"/>
+          <v:rect id="_x0000_i1047" style="width:0;height:1.5pt" o:hralign="center" o:hrstd="t" o:hr="t" fillcolor="#a0a0a0" stroked="f"/>
         </w:pict>
       </w:r>
     </w:p>
@@ -4867,9 +5054,11 @@
             <w:hideMark/>
           </w:tcPr>
           <w:p>
+            <w:proofErr w:type="spellStart"/>
             <w:r>
               <w:t>feedback_id</w:t>
             </w:r>
+            <w:proofErr w:type="spellEnd"/>
           </w:p>
         </w:tc>
         <w:tc>
@@ -4891,8 +5080,13 @@
             <w:hideMark/>
           </w:tcPr>
           <w:p>
-            <w:r>
-              <w:t>PK,AUTO_INCREMENT</w:t>
+            <w:proofErr w:type="gramStart"/>
+            <w:r>
+              <w:t>PK,AUTO</w:t>
+            </w:r>
+            <w:proofErr w:type="gramEnd"/>
+            <w:r>
+              <w:t>_INCREMENT</w:t>
             </w:r>
           </w:p>
         </w:tc>
@@ -4908,9 +5102,11 @@
             <w:hideMark/>
           </w:tcPr>
           <w:p>
+            <w:proofErr w:type="spellStart"/>
             <w:r>
               <w:t>complaint_id</w:t>
             </w:r>
+            <w:proofErr w:type="spellEnd"/>
           </w:p>
         </w:tc>
         <w:tc>
@@ -4949,9 +5145,11 @@
             <w:hideMark/>
           </w:tcPr>
           <w:p>
+            <w:proofErr w:type="spellStart"/>
             <w:r>
               <w:t>user_id</w:t>
             </w:r>
+            <w:proofErr w:type="spellEnd"/>
           </w:p>
         </w:tc>
         <w:tc>
@@ -5072,9 +5270,11 @@
             <w:hideMark/>
           </w:tcPr>
           <w:p>
+            <w:proofErr w:type="spellStart"/>
             <w:r>
               <w:t>created_at</w:t>
             </w:r>
+            <w:proofErr w:type="spellEnd"/>
           </w:p>
         </w:tc>
         <w:tc>
@@ -5106,7 +5306,7 @@
     <w:p>
       <w:r>
         <w:pict w14:anchorId="61DFFBCB">
-          <v:rect id="_x0000_i1055" style="width:451.3pt;height:1.5pt;mso-position-vertical:absolute" o:hralign="center" o:bullet="t" o:hrstd="t" o:hr="t" fillcolor="#a0a0a0" stroked="f"/>
+          <v:rect id="_x0000_i1048" style="width:451.3pt;height:1.5pt;mso-position-vertical:absolute" o:hralign="center" o:bullet="t" o:hrstd="t" o:hr="t" fillcolor="#a0a0a0" stroked="f"/>
         </w:pict>
       </w:r>
     </w:p>
@@ -5117,6 +5317,7 @@
           <w:bCs/>
         </w:rPr>
       </w:pPr>
+      <w:proofErr w:type="spellStart"/>
       <w:r>
         <w:rPr>
           <w:b/>
@@ -5124,6 +5325,7 @@
         </w:rPr>
         <w:t>complaint_evidence</w:t>
       </w:r>
+      <w:proofErr w:type="spellEnd"/>
     </w:p>
     <w:tbl>
       <w:tblPr>
@@ -5225,9 +5427,11 @@
             <w:hideMark/>
           </w:tcPr>
           <w:p>
+            <w:proofErr w:type="spellStart"/>
             <w:r>
               <w:t>evidence_id</w:t>
             </w:r>
+            <w:proofErr w:type="spellEnd"/>
           </w:p>
         </w:tc>
         <w:tc>
@@ -5249,8 +5453,13 @@
             <w:hideMark/>
           </w:tcPr>
           <w:p>
-            <w:r>
-              <w:t>PK,AUTO_INCREMENT</w:t>
+            <w:proofErr w:type="gramStart"/>
+            <w:r>
+              <w:t>PK,AUTO</w:t>
+            </w:r>
+            <w:proofErr w:type="gramEnd"/>
+            <w:r>
+              <w:t>_INCREMENT</w:t>
             </w:r>
           </w:p>
         </w:tc>
@@ -5266,9 +5475,11 @@
             <w:hideMark/>
           </w:tcPr>
           <w:p>
+            <w:proofErr w:type="spellStart"/>
             <w:r>
               <w:t>complaint_id</w:t>
             </w:r>
+            <w:proofErr w:type="spellEnd"/>
           </w:p>
         </w:tc>
         <w:tc>
@@ -5307,9 +5518,11 @@
             <w:hideMark/>
           </w:tcPr>
           <w:p>
+            <w:proofErr w:type="spellStart"/>
             <w:r>
               <w:t>file_name</w:t>
             </w:r>
+            <w:proofErr w:type="spellEnd"/>
           </w:p>
         </w:tc>
         <w:tc>
@@ -5319,8 +5532,13 @@
             <w:hideMark/>
           </w:tcPr>
           <w:p>
-            <w:r>
-              <w:t>VARCHAR(255)</w:t>
+            <w:proofErr w:type="gramStart"/>
+            <w:r>
+              <w:t>VARCHAR(</w:t>
+            </w:r>
+            <w:proofErr w:type="gramEnd"/>
+            <w:r>
+              <w:t>255)</w:t>
             </w:r>
           </w:p>
         </w:tc>
@@ -5348,9 +5566,11 @@
             <w:hideMark/>
           </w:tcPr>
           <w:p>
+            <w:proofErr w:type="spellStart"/>
             <w:r>
               <w:t>file_path</w:t>
             </w:r>
+            <w:proofErr w:type="spellEnd"/>
           </w:p>
         </w:tc>
         <w:tc>
@@ -5360,8 +5580,13 @@
             <w:hideMark/>
           </w:tcPr>
           <w:p>
-            <w:r>
-              <w:t>VARCHAR(500)</w:t>
+            <w:proofErr w:type="gramStart"/>
+            <w:r>
+              <w:t>VARCHAR(</w:t>
+            </w:r>
+            <w:proofErr w:type="gramEnd"/>
+            <w:r>
+              <w:t>500)</w:t>
             </w:r>
           </w:p>
         </w:tc>
@@ -5389,9 +5614,11 @@
             <w:hideMark/>
           </w:tcPr>
           <w:p>
+            <w:proofErr w:type="spellStart"/>
             <w:r>
               <w:t>file_type</w:t>
             </w:r>
+            <w:proofErr w:type="spellEnd"/>
           </w:p>
         </w:tc>
         <w:tc>
@@ -5401,8 +5628,13 @@
             <w:hideMark/>
           </w:tcPr>
           <w:p>
-            <w:r>
-              <w:t>VARCHAR(50)</w:t>
+            <w:proofErr w:type="gramStart"/>
+            <w:r>
+              <w:t>VARCHAR(</w:t>
+            </w:r>
+            <w:proofErr w:type="gramEnd"/>
+            <w:r>
+              <w:t>50)</w:t>
             </w:r>
           </w:p>
         </w:tc>
@@ -5430,9 +5662,11 @@
             <w:hideMark/>
           </w:tcPr>
           <w:p>
+            <w:proofErr w:type="spellStart"/>
             <w:r>
               <w:t>uploaded_at</w:t>
             </w:r>
+            <w:proofErr w:type="spellEnd"/>
           </w:p>
         </w:tc>
         <w:tc>
@@ -5470,7 +5704,7 @@
       </w:pPr>
       <w:r>
         <w:pict w14:anchorId="39279140">
-          <v:rect id="_x0000_i1064" style="width:451.3pt;height:1.5pt;mso-position-vertical:absolute" o:hralign="center" o:bullet="t" o:hrstd="t" o:hr="t" fillcolor="#a0a0a0" stroked="f"/>
+          <v:rect id="_x0000_i1049" style="width:451.3pt;height:1.5pt;mso-position-vertical:absolute" o:hralign="center" o:bullet="t" o:hrstd="t" o:hr="t" fillcolor="#a0a0a0" stroked="f"/>
         </w:pict>
       </w:r>
     </w:p>
@@ -5537,6 +5771,7 @@
           <w:bCs/>
         </w:rPr>
       </w:pPr>
+      <w:proofErr w:type="spellStart"/>
       <w:r>
         <w:rPr>
           <w:b/>
@@ -5545,6 +5780,7 @@
         <w:lastRenderedPageBreak/>
         <w:t>activity_logs</w:t>
       </w:r>
+      <w:proofErr w:type="spellEnd"/>
     </w:p>
     <w:tbl>
       <w:tblPr>
@@ -5646,9 +5882,11 @@
             <w:hideMark/>
           </w:tcPr>
           <w:p>
+            <w:proofErr w:type="spellStart"/>
             <w:r>
               <w:t>log_id</w:t>
             </w:r>
+            <w:proofErr w:type="spellEnd"/>
           </w:p>
         </w:tc>
         <w:tc>
@@ -5687,9 +5925,11 @@
             <w:hideMark/>
           </w:tcPr>
           <w:p>
+            <w:proofErr w:type="spellStart"/>
             <w:r>
               <w:t>user_type</w:t>
             </w:r>
+            <w:proofErr w:type="spellEnd"/>
           </w:p>
         </w:tc>
         <w:tc>
@@ -5700,7 +5940,15 @@
           </w:tcPr>
           <w:p>
             <w:r>
-              <w:t>ENUM('Citizen','Officer','Admin')</w:t>
+              <w:t>ENUM('</w:t>
+            </w:r>
+            <w:proofErr w:type="spellStart"/>
+            <w:r>
+              <w:t>Citizen','Officer','Admin</w:t>
+            </w:r>
+            <w:proofErr w:type="spellEnd"/>
+            <w:r>
+              <w:t>')</w:t>
             </w:r>
           </w:p>
         </w:tc>
@@ -5728,9 +5976,11 @@
             <w:hideMark/>
           </w:tcPr>
           <w:p>
+            <w:proofErr w:type="spellStart"/>
             <w:r>
               <w:t>user_id</w:t>
             </w:r>
+            <w:proofErr w:type="spellEnd"/>
           </w:p>
         </w:tc>
         <w:tc>
@@ -5781,8 +6031,13 @@
             <w:hideMark/>
           </w:tcPr>
           <w:p>
-            <w:r>
-              <w:t>VARCHAR(255)</w:t>
+            <w:proofErr w:type="gramStart"/>
+            <w:r>
+              <w:t>VARCHAR(</w:t>
+            </w:r>
+            <w:proofErr w:type="gramEnd"/>
+            <w:r>
+              <w:t>255)</w:t>
             </w:r>
           </w:p>
         </w:tc>
@@ -5810,9 +6065,11 @@
             <w:hideMark/>
           </w:tcPr>
           <w:p>
+            <w:proofErr w:type="spellStart"/>
             <w:r>
               <w:t>table_name</w:t>
             </w:r>
+            <w:proofErr w:type="spellEnd"/>
           </w:p>
         </w:tc>
         <w:tc>
@@ -5822,8 +6079,13 @@
             <w:hideMark/>
           </w:tcPr>
           <w:p>
-            <w:r>
-              <w:t>VARCHAR(100)</w:t>
+            <w:proofErr w:type="gramStart"/>
+            <w:r>
+              <w:t>VARCHAR(</w:t>
+            </w:r>
+            <w:proofErr w:type="gramEnd"/>
+            <w:r>
+              <w:t>100)</w:t>
             </w:r>
           </w:p>
         </w:tc>
@@ -5851,9 +6113,11 @@
             <w:hideMark/>
           </w:tcPr>
           <w:p>
+            <w:proofErr w:type="spellStart"/>
             <w:r>
               <w:t>record_id</w:t>
             </w:r>
+            <w:proofErr w:type="spellEnd"/>
           </w:p>
         </w:tc>
         <w:tc>
@@ -5892,9 +6156,11 @@
             <w:hideMark/>
           </w:tcPr>
           <w:p>
+            <w:proofErr w:type="spellStart"/>
             <w:r>
               <w:t>ip_address</w:t>
             </w:r>
+            <w:proofErr w:type="spellEnd"/>
           </w:p>
         </w:tc>
         <w:tc>
@@ -5904,8 +6170,13 @@
             <w:hideMark/>
           </w:tcPr>
           <w:p>
-            <w:r>
-              <w:t>VARCHAR(45)</w:t>
+            <w:proofErr w:type="gramStart"/>
+            <w:r>
+              <w:t>VARCHAR(</w:t>
+            </w:r>
+            <w:proofErr w:type="gramEnd"/>
+            <w:r>
+              <w:t>45)</w:t>
             </w:r>
           </w:p>
         </w:tc>
@@ -5933,9 +6204,11 @@
             <w:hideMark/>
           </w:tcPr>
           <w:p>
+            <w:proofErr w:type="spellStart"/>
             <w:r>
               <w:t>created_at</w:t>
             </w:r>
+            <w:proofErr w:type="spellEnd"/>
           </w:p>
         </w:tc>
         <w:tc>
@@ -5973,7 +6246,7 @@
       </w:pPr>
       <w:r>
         <w:pict w14:anchorId="130DCF04">
-          <v:rect id="_x0000_i1065" style="width:451.3pt;height:1.5pt;mso-position-vertical:absolute" o:hralign="center" o:bullet="t" o:hrstd="t" o:hr="t" fillcolor="#a0a0a0" stroked="f"/>
+          <v:rect id="_x0000_i1050" style="width:451.3pt;height:1.5pt;mso-position-vertical:absolute" o:hralign="center" o:bullet="t" o:hrstd="t" o:hr="t" fillcolor="#a0a0a0" stroked="f"/>
         </w:pict>
       </w:r>
     </w:p>
@@ -6065,7 +6338,7 @@
     <w:p>
       <w:r>
         <w:pict w14:anchorId="68CB8A76">
-          <v:rect id="_x0000_i1048" style="width:0;height:1.5pt" o:hralign="center" o:hrstd="t" o:hr="t" fillcolor="#a0a0a0" stroked="f"/>
+          <v:rect id="_x0000_i1051" style="width:0;height:1.5pt" o:hralign="center" o:hrstd="t" o:hr="t" fillcolor="#a0a0a0" stroked="f"/>
         </w:pict>
       </w:r>
     </w:p>
@@ -6142,7 +6415,7 @@
     <w:p>
       <w:r>
         <w:pict w14:anchorId="638BCA66">
-          <v:rect id="_x0000_i1049" style="width:0;height:1.5pt" o:hralign="center" o:hrstd="t" o:hr="t" fillcolor="#a0a0a0" stroked="f"/>
+          <v:rect id="_x0000_i1052" style="width:0;height:1.5pt" o:hralign="center" o:hrstd="t" o:hr="t" fillcolor="#a0a0a0" stroked="f"/>
         </w:pict>
       </w:r>
     </w:p>
@@ -6264,7 +6537,7 @@
     <w:p>
       <w:r>
         <w:pict w14:anchorId="04E09CBA">
-          <v:rect id="_x0000_i1050" style="width:0;height:1.5pt" o:hralign="center" o:hrstd="t" o:hr="t" fillcolor="#a0a0a0" stroked="f"/>
+          <v:rect id="_x0000_i1053" style="width:0;height:1.5pt" o:hralign="center" o:hrstd="t" o:hr="t" fillcolor="#a0a0a0" stroked="f"/>
         </w:pict>
       </w:r>
     </w:p>
@@ -6327,8 +6600,13 @@
         <w:t>──</w:t>
       </w:r>
       <w:r>
-        <w:t xml:space="preserve"> dashboard.php</w:t>
-      </w:r>
+        <w:t xml:space="preserve"> </w:t>
+      </w:r>
+      <w:proofErr w:type="spellStart"/>
+      <w:r>
+        <w:t>dashboard.php</w:t>
+      </w:r>
+      <w:proofErr w:type="spellEnd"/>
     </w:p>
     <w:p>
       <w:r>
@@ -6347,8 +6625,13 @@
         <w:t>──</w:t>
       </w:r>
       <w:r>
-        <w:t xml:space="preserve"> complaints.php</w:t>
-      </w:r>
+        <w:t xml:space="preserve"> </w:t>
+      </w:r>
+      <w:proofErr w:type="spellStart"/>
+      <w:r>
+        <w:t>complaints.php</w:t>
+      </w:r>
+      <w:proofErr w:type="spellEnd"/>
     </w:p>
     <w:p>
       <w:r>
@@ -6367,8 +6650,13 @@
         <w:t>──</w:t>
       </w:r>
       <w:r>
-        <w:t xml:space="preserve"> users.php</w:t>
-      </w:r>
+        <w:t xml:space="preserve"> </w:t>
+      </w:r>
+      <w:proofErr w:type="spellStart"/>
+      <w:r>
+        <w:t>users.php</w:t>
+      </w:r>
+      <w:proofErr w:type="spellEnd"/>
     </w:p>
     <w:p>
       <w:r>
@@ -6387,8 +6675,13 @@
         <w:t>──</w:t>
       </w:r>
       <w:r>
-        <w:t xml:space="preserve"> officers.php</w:t>
-      </w:r>
+        <w:t xml:space="preserve"> </w:t>
+      </w:r>
+      <w:proofErr w:type="spellStart"/>
+      <w:r>
+        <w:t>officers.php</w:t>
+      </w:r>
+      <w:proofErr w:type="spellEnd"/>
     </w:p>
     <w:p>
       <w:r>
@@ -6407,8 +6700,13 @@
         <w:t>──</w:t>
       </w:r>
       <w:r>
-        <w:t xml:space="preserve"> categories.php</w:t>
-      </w:r>
+        <w:t xml:space="preserve"> </w:t>
+      </w:r>
+      <w:proofErr w:type="spellStart"/>
+      <w:r>
+        <w:t>categories.php</w:t>
+      </w:r>
+      <w:proofErr w:type="spellEnd"/>
     </w:p>
     <w:p>
       <w:r>
@@ -6427,13 +6725,23 @@
         <w:t>──</w:t>
       </w:r>
       <w:r>
-        <w:t xml:space="preserve"> reports.php</w:t>
-      </w:r>
-    </w:p>
-    <w:p>
-      <w:r>
-        <w:t>│   └── settings.php</w:t>
-      </w:r>
+        <w:t xml:space="preserve"> </w:t>
+      </w:r>
+      <w:proofErr w:type="spellStart"/>
+      <w:r>
+        <w:t>reports.php</w:t>
+      </w:r>
+      <w:proofErr w:type="spellEnd"/>
+    </w:p>
+    <w:p>
+      <w:r>
+        <w:t xml:space="preserve">│   └── </w:t>
+      </w:r>
+      <w:proofErr w:type="spellStart"/>
+      <w:r>
+        <w:t>settings.php</w:t>
+      </w:r>
+      <w:proofErr w:type="spellEnd"/>
     </w:p>
     <w:p>
       <w:r>
@@ -6474,8 +6782,13 @@
         <w:t>──</w:t>
       </w:r>
       <w:r>
-        <w:t xml:space="preserve"> dashboard.php</w:t>
-      </w:r>
+        <w:t xml:space="preserve"> </w:t>
+      </w:r>
+      <w:proofErr w:type="spellStart"/>
+      <w:r>
+        <w:t>dashboard.php</w:t>
+      </w:r>
+      <w:proofErr w:type="spellEnd"/>
     </w:p>
     <w:p>
       <w:r>
@@ -6494,8 +6807,13 @@
         <w:t>──</w:t>
       </w:r>
       <w:r>
-        <w:t xml:space="preserve"> assigned_cases.php</w:t>
-      </w:r>
+        <w:t xml:space="preserve"> </w:t>
+      </w:r>
+      <w:proofErr w:type="spellStart"/>
+      <w:r>
+        <w:t>assigned_cases.php</w:t>
+      </w:r>
+      <w:proofErr w:type="spellEnd"/>
     </w:p>
     <w:p>
       <w:r>
@@ -6514,13 +6832,23 @@
         <w:t>──</w:t>
       </w:r>
       <w:r>
-        <w:t xml:space="preserve"> investigation.php</w:t>
-      </w:r>
-    </w:p>
-    <w:p>
-      <w:r>
-        <w:t>│   └── reports.php</w:t>
-      </w:r>
+        <w:t xml:space="preserve"> </w:t>
+      </w:r>
+      <w:proofErr w:type="spellStart"/>
+      <w:r>
+        <w:t>investigation.php</w:t>
+      </w:r>
+      <w:proofErr w:type="spellEnd"/>
+    </w:p>
+    <w:p>
+      <w:r>
+        <w:t xml:space="preserve">│   └── </w:t>
+      </w:r>
+      <w:proofErr w:type="spellStart"/>
+      <w:r>
+        <w:t>reports.php</w:t>
+      </w:r>
+      <w:proofErr w:type="spellEnd"/>
     </w:p>
     <w:p>
       <w:r>
@@ -6562,8 +6890,13 @@
         <w:t>──</w:t>
       </w:r>
       <w:r>
-        <w:t xml:space="preserve"> dashboard.php</w:t>
-      </w:r>
+        <w:t xml:space="preserve"> </w:t>
+      </w:r>
+      <w:proofErr w:type="spellStart"/>
+      <w:r>
+        <w:t>dashboard.php</w:t>
+      </w:r>
+      <w:proofErr w:type="spellEnd"/>
     </w:p>
     <w:p>
       <w:r>
@@ -6582,8 +6915,13 @@
         <w:t>──</w:t>
       </w:r>
       <w:r>
-        <w:t xml:space="preserve"> file_complaint.php</w:t>
-      </w:r>
+        <w:t xml:space="preserve"> </w:t>
+      </w:r>
+      <w:proofErr w:type="spellStart"/>
+      <w:r>
+        <w:t>file_complaint.php</w:t>
+      </w:r>
+      <w:proofErr w:type="spellEnd"/>
     </w:p>
     <w:p>
       <w:r>
@@ -6602,8 +6940,13 @@
         <w:t>──</w:t>
       </w:r>
       <w:r>
-        <w:t xml:space="preserve"> my_complaints.php</w:t>
-      </w:r>
+        <w:t xml:space="preserve"> </w:t>
+      </w:r>
+      <w:proofErr w:type="spellStart"/>
+      <w:r>
+        <w:t>my_complaints.php</w:t>
+      </w:r>
+      <w:proofErr w:type="spellEnd"/>
     </w:p>
     <w:p>
       <w:r>
@@ -6622,13 +6965,23 @@
         <w:t>──</w:t>
       </w:r>
       <w:r>
-        <w:t xml:space="preserve"> notifications.php</w:t>
-      </w:r>
-    </w:p>
-    <w:p>
-      <w:r>
-        <w:t>│   └── profile.php</w:t>
-      </w:r>
+        <w:t xml:space="preserve"> </w:t>
+      </w:r>
+      <w:proofErr w:type="spellStart"/>
+      <w:r>
+        <w:t>notifications.php</w:t>
+      </w:r>
+      <w:proofErr w:type="spellEnd"/>
+    </w:p>
+    <w:p>
+      <w:r>
+        <w:t xml:space="preserve">│   └── </w:t>
+      </w:r>
+      <w:proofErr w:type="spellStart"/>
+      <w:r>
+        <w:t>profile.php</w:t>
+      </w:r>
+      <w:proofErr w:type="spellEnd"/>
     </w:p>
     <w:p>
       <w:r>
@@ -6649,7 +7002,15 @@
         <w:t>──</w:t>
       </w:r>
       <w:r>
-        <w:t xml:space="preserve"> api/</w:t>
+        <w:t xml:space="preserve"> </w:t>
+      </w:r>
+      <w:proofErr w:type="spellStart"/>
+      <w:r>
+        <w:t>api</w:t>
+      </w:r>
+      <w:proofErr w:type="spellEnd"/>
+      <w:r>
+        <w:t>/</w:t>
       </w:r>
     </w:p>
     <w:p>
@@ -6669,8 +7030,13 @@
         <w:t>──</w:t>
       </w:r>
       <w:r>
-        <w:t xml:space="preserve"> complaint_insert.php</w:t>
-      </w:r>
+        <w:t xml:space="preserve"> </w:t>
+      </w:r>
+      <w:proofErr w:type="spellStart"/>
+      <w:r>
+        <w:t>complaint_insert.php</w:t>
+      </w:r>
+      <w:proofErr w:type="spellEnd"/>
     </w:p>
     <w:p>
       <w:r>
@@ -6689,8 +7055,13 @@
         <w:t>──</w:t>
       </w:r>
       <w:r>
-        <w:t xml:space="preserve"> complaint_update.php</w:t>
-      </w:r>
+        <w:t xml:space="preserve"> </w:t>
+      </w:r>
+      <w:proofErr w:type="spellStart"/>
+      <w:r>
+        <w:t>complaint_update.php</w:t>
+      </w:r>
+      <w:proofErr w:type="spellEnd"/>
     </w:p>
     <w:p>
       <w:r>
@@ -6709,8 +7080,13 @@
         <w:t>──</w:t>
       </w:r>
       <w:r>
-        <w:t xml:space="preserve"> complaint_fetch.php</w:t>
-      </w:r>
+        <w:t xml:space="preserve"> </w:t>
+      </w:r>
+      <w:proofErr w:type="spellStart"/>
+      <w:r>
+        <w:t>complaint_fetch.php</w:t>
+      </w:r>
+      <w:proofErr w:type="spellEnd"/>
     </w:p>
     <w:p>
       <w:r>
@@ -6729,13 +7105,23 @@
         <w:t>──</w:t>
       </w:r>
       <w:r>
-        <w:t xml:space="preserve"> user_login.php</w:t>
-      </w:r>
-    </w:p>
-    <w:p>
-      <w:r>
-        <w:t>│   └── officer_login.php</w:t>
-      </w:r>
+        <w:t xml:space="preserve"> </w:t>
+      </w:r>
+      <w:proofErr w:type="spellStart"/>
+      <w:r>
+        <w:t>user_login.php</w:t>
+      </w:r>
+      <w:proofErr w:type="spellEnd"/>
+    </w:p>
+    <w:p>
+      <w:r>
+        <w:t xml:space="preserve">│   └── </w:t>
+      </w:r>
+      <w:proofErr w:type="spellStart"/>
+      <w:r>
+        <w:t>officer_login.php</w:t>
+      </w:r>
+      <w:proofErr w:type="spellEnd"/>
     </w:p>
     <w:p>
       <w:r>
@@ -6776,8 +7162,13 @@
         <w:t>──</w:t>
       </w:r>
       <w:r>
-        <w:t xml:space="preserve"> db.php</w:t>
-      </w:r>
+        <w:t xml:space="preserve"> </w:t>
+      </w:r>
+      <w:proofErr w:type="spellStart"/>
+      <w:r>
+        <w:t>db.php</w:t>
+      </w:r>
+      <w:proofErr w:type="spellEnd"/>
     </w:p>
     <w:p>
       <w:r>
@@ -6796,8 +7187,13 @@
         <w:t>──</w:t>
       </w:r>
       <w:r>
-        <w:t xml:space="preserve"> header.php</w:t>
-      </w:r>
+        <w:t xml:space="preserve"> </w:t>
+      </w:r>
+      <w:proofErr w:type="spellStart"/>
+      <w:r>
+        <w:t>header.php</w:t>
+      </w:r>
+      <w:proofErr w:type="spellEnd"/>
     </w:p>
     <w:p>
       <w:r>
@@ -6816,8 +7212,13 @@
         <w:t>──</w:t>
       </w:r>
       <w:r>
-        <w:t xml:space="preserve"> footer.php</w:t>
-      </w:r>
+        <w:t xml:space="preserve"> </w:t>
+      </w:r>
+      <w:proofErr w:type="spellStart"/>
+      <w:r>
+        <w:t>footer.php</w:t>
+      </w:r>
+      <w:proofErr w:type="spellEnd"/>
     </w:p>
     <w:p>
       <w:r>
@@ -6836,13 +7237,23 @@
         <w:t>──</w:t>
       </w:r>
       <w:r>
-        <w:t xml:space="preserve"> sidebar.php</w:t>
-      </w:r>
-    </w:p>
-    <w:p>
-      <w:r>
-        <w:t>│   └── auth.php</w:t>
-      </w:r>
+        <w:t xml:space="preserve"> </w:t>
+      </w:r>
+      <w:proofErr w:type="spellStart"/>
+      <w:r>
+        <w:t>sidebar.php</w:t>
+      </w:r>
+      <w:proofErr w:type="spellEnd"/>
+    </w:p>
+    <w:p>
+      <w:r>
+        <w:t xml:space="preserve">│   └── </w:t>
+      </w:r>
+      <w:proofErr w:type="spellStart"/>
+      <w:r>
+        <w:t>auth.php</w:t>
+      </w:r>
+      <w:proofErr w:type="spellEnd"/>
     </w:p>
     <w:p>
       <w:r>
@@ -6930,7 +7341,15 @@
         <w:t>──</w:t>
       </w:r>
       <w:r>
-        <w:t xml:space="preserve"> css/</w:t>
+        <w:t xml:space="preserve"> </w:t>
+      </w:r>
+      <w:proofErr w:type="spellStart"/>
+      <w:r>
+        <w:t>css</w:t>
+      </w:r>
+      <w:proofErr w:type="spellEnd"/>
+      <w:r>
+        <w:t>/</w:t>
       </w:r>
     </w:p>
     <w:p>
@@ -6950,7 +7369,15 @@
         <w:t>──</w:t>
       </w:r>
       <w:r>
-        <w:t xml:space="preserve"> js/</w:t>
+        <w:t xml:space="preserve"> </w:t>
+      </w:r>
+      <w:proofErr w:type="spellStart"/>
+      <w:r>
+        <w:t>js</w:t>
+      </w:r>
+      <w:proofErr w:type="spellEnd"/>
+      <w:r>
+        <w:t>/</w:t>
       </w:r>
     </w:p>
     <w:p>
@@ -6998,8 +7425,13 @@
         <w:t>──</w:t>
       </w:r>
       <w:r>
-        <w:t xml:space="preserve"> index.php</w:t>
-      </w:r>
+        <w:t xml:space="preserve"> </w:t>
+      </w:r>
+      <w:proofErr w:type="spellStart"/>
+      <w:r>
+        <w:t>index.php</w:t>
+      </w:r>
+      <w:proofErr w:type="spellEnd"/>
     </w:p>
     <w:p>
       <w:r>
@@ -7015,8 +7447,13 @@
         <w:t>──</w:t>
       </w:r>
       <w:r>
-        <w:t xml:space="preserve"> login.php</w:t>
-      </w:r>
+        <w:t xml:space="preserve"> </w:t>
+      </w:r>
+      <w:proofErr w:type="spellStart"/>
+      <w:r>
+        <w:t>login.php</w:t>
+      </w:r>
+      <w:proofErr w:type="spellEnd"/>
     </w:p>
     <w:p>
       <w:r>
@@ -7032,18 +7469,28 @@
         <w:t>──</w:t>
       </w:r>
       <w:r>
-        <w:t xml:space="preserve"> register.php</w:t>
-      </w:r>
-    </w:p>
-    <w:p>
-      <w:r>
-        <w:t>└── logout.php</w:t>
-      </w:r>
+        <w:t xml:space="preserve"> </w:t>
+      </w:r>
+      <w:proofErr w:type="spellStart"/>
+      <w:r>
+        <w:t>register.php</w:t>
+      </w:r>
+      <w:proofErr w:type="spellEnd"/>
+    </w:p>
+    <w:p>
+      <w:r>
+        <w:t xml:space="preserve">└── </w:t>
+      </w:r>
+      <w:proofErr w:type="spellStart"/>
+      <w:r>
+        <w:t>logout.php</w:t>
+      </w:r>
+      <w:proofErr w:type="spellEnd"/>
     </w:p>
     <w:p>
       <w:r>
         <w:pict w14:anchorId="37E92DBD">
-          <v:rect id="_x0000_i1051" style="width:0;height:1.5pt" o:hralign="center" o:hrstd="t" o:hr="t" fillcolor="#a0a0a0" stroked="f"/>
+          <v:rect id="_x0000_i1054" style="width:0;height:1.5pt" o:hralign="center" o:hrstd="t" o:hr="t" fillcolor="#a0a0a0" stroked="f"/>
         </w:pict>
       </w:r>
     </w:p>
@@ -7103,7 +7550,15 @@
         </w:numPr>
       </w:pPr>
       <w:r>
-        <w:t>Email notification (PHPMailer)</w:t>
+        <w:t>Email notification (</w:t>
+      </w:r>
+      <w:proofErr w:type="spellStart"/>
+      <w:r>
+        <w:t>PHPMailer</w:t>
+      </w:r>
+      <w:proofErr w:type="spellEnd"/>
+      <w:r>
+        <w:t>)</w:t>
       </w:r>
     </w:p>
     <w:p>
@@ -7186,7 +7641,7 @@
     <w:p>
       <w:r>
         <w:pict w14:anchorId="078C7EE9">
-          <v:rect id="_x0000_i1052" style="width:0;height:1.5pt" o:hralign="center" o:hrstd="t" o:hr="t" fillcolor="#a0a0a0" stroked="f"/>
+          <v:rect id="_x0000_i1055" style="width:0;height:1.5pt" o:hralign="center" o:hrstd="t" o:hr="t" fillcolor="#a0a0a0" stroked="f"/>
         </w:pict>
       </w:r>
     </w:p>
@@ -7318,7 +7773,7 @@
 <w:numbering xmlns:wpc="http://schemas.microsoft.com/office/word/2010/wordprocessingCanvas" xmlns:cx="http://schemas.microsoft.com/office/drawing/2014/chartex" xmlns:cx1="http://schemas.microsoft.com/office/drawing/2015/9/8/chartex" xmlns:cx2="http://schemas.microsoft.com/office/drawing/2015/10/21/chartex" xmlns:cx3="http://schemas.microsoft.com/office/drawing/2016/5/9/chartex" xmlns:cx4="http://schemas.microsoft.com/office/drawing/2016/5/10/chartex" xmlns:cx5="http://schemas.microsoft.com/office/drawing/2016/5/11/chartex" xmlns:cx6="http://schemas.microsoft.com/office/drawing/2016/5/12/chartex" xmlns:cx7="http://schemas.microsoft.com/office/drawing/2016/5/13/chartex" xmlns:cx8="http://schemas.microsoft.com/office/drawing/2016/5/14/chartex" xmlns:mc="http://schemas.openxmlformats.org/markup-compatibility/2006" xmlns:aink="http://schemas.microsoft.com/office/drawing/2016/ink" xmlns:am3d="http://schemas.microsoft.com/office/drawing/2017/model3d" xmlns:o="urn:schemas-microsoft-com:office:office" xmlns:oel="http://schemas.microsoft.com/office/2019/extlst" xmlns:r="http://schemas.openxmlformats.org/officeDocument/2006/relationships" xmlns:m="http://schemas.openxmlformats.org/officeDocument/2006/math" xmlns:v="urn:schemas-microsoft-com:vml" xmlns:wp14="http://schemas.microsoft.com/office/word/2010/wordprocessingDrawing" xmlns:wp="http://schemas.openxmlformats.org/drawingml/2006/wordprocessingDrawing" xmlns:w10="urn:schemas-microsoft-com:office:word" xmlns:w="http://schemas.openxmlformats.org/wordprocessingml/2006/main" xmlns:w14="http://schemas.microsoft.com/office/word/2010/wordml" xmlns:w15="http://schemas.microsoft.com/office/word/2012/wordml" xmlns:w16cex="http://schemas.microsoft.com/office/word/2018/wordml/cex" xmlns:w16cid="http://schemas.microsoft.com/office/word/2016/wordml/cid" xmlns:w16="http://schemas.microsoft.com/office/word/2018/wordml" xmlns:w16sdtdh="http://schemas.microsoft.com/office/word/2020/wordml/sdtdatahash" xmlns:w16se="http://schemas.microsoft.com/office/word/2015/wordml/symex" xmlns:wpg="http://schemas.microsoft.com/office/word/2010/wordprocessingGroup" xmlns:wpi="http://schemas.microsoft.com/office/word/2010/wordprocessingInk" xmlns:wne="http://schemas.microsoft.com/office/word/2006/wordml" xmlns:wps="http://schemas.microsoft.com/office/word/2010/wordprocessingShape" mc:Ignorable="w14 w15 w16se w16cid w16 w16cex w16sdtdh wp14">
   <w:numPicBullet w:numPicBulletId="0">
     <w:pict>
-      <v:rect id="_x0000_i1048" style="width:0;height:1.5pt" o:hralign="center" o:bullet="t" o:hrstd="t" o:hr="t" fillcolor="#a0a0a0" stroked="f"/>
+      <v:rect id="_x0000_i1082" style="width:0;height:1.5pt" o:hralign="center" o:bullet="t" o:hrstd="t" o:hr="t" fillcolor="#a0a0a0" stroked="f"/>
     </w:pict>
   </w:numPicBullet>
   <w:abstractNum w:abstractNumId="0" w15:restartNumberingAfterBreak="0">
@@ -11387,6 +11842,7 @@
   <w:style w:type="character" w:default="1" w:styleId="DefaultParagraphFont">
     <w:name w:val="Default Paragraph Font"/>
     <w:uiPriority w:val="1"/>
+    <w:semiHidden/>
     <w:unhideWhenUsed/>
   </w:style>
   <w:style w:type="table" w:default="1" w:styleId="TableNormal">

</xml_diff>